<commit_message>
DOC-4: fix date mapping, add PI/contact fields, research content & personnel placeholders
- Fix execution date OO placeholder order (month/day per row, not grouped)
- Fix ○○○ mapping: PI name/title + contact name/title (was all pi_name_zh)
- Inject phone, fax, email, address placeholders for PI and contact
- Inject research content placeholders: purpose, background, methodology, expected_outcome, references
- Inject personnel table loop: role, name, title, work_description
- Add fax and address fields to Step2Personnel UI
- Add CLAUDE.md to .gitignore
- Regenerate all DOC templates

Co-Authored-By: Claude Opus 4.6 <noreply@anthropic.com>
</commit_message>
<xml_diff>
--- a/public/templates/DOC-4.docx
+++ b/public/templates/DOC-4.docx
@@ -2186,7 +2186,7 @@
                 <w:sz w:val="20"/>
                 <w:szCs w:val="20"/>
               </w:rPr>
-              <w:t>{exec_start_m}</w:t>
+              <w:t>{exec_start_d}</w:t>
             </w:r>
           </w:p>
         </w:tc>
@@ -2341,7 +2341,7 @@
                 <w:sz w:val="20"/>
                 <w:szCs w:val="20"/>
               </w:rPr>
-              <w:t>{exec_start_d}</w:t>
+              <w:t>{exec_start_m}</w:t>
             </w:r>
           </w:p>
         </w:tc>
@@ -2907,7 +2907,7 @@
                 <w:sz w:val="20"/>
                 <w:szCs w:val="20"/>
               </w:rPr>
-              <w:t>{exec_end_m}</w:t>
+              <w:t>{exec_end_d}</w:t>
             </w:r>
           </w:p>
         </w:tc>
@@ -3053,7 +3053,7 @@
                 <w:sz w:val="20"/>
                 <w:szCs w:val="20"/>
               </w:rPr>
-              <w:t>{exec_end_d}</w:t>
+              <w:t>{exec_end_m}</w:t>
             </w:r>
           </w:p>
         </w:tc>
@@ -4214,7 +4214,7 @@
                 <w:sz w:val="20"/>
                 <w:szCs w:val="20"/>
               </w:rPr>
-              <w:t>{pi_name_zh}</w:t>
+              <w:t>{pi_title}</w:t>
             </w:r>
           </w:p>
         </w:tc>
@@ -4272,6 +4272,9 @@
                 <w:szCs w:val="20"/>
               </w:rPr>
             </w:pPr>
+            <w:r>
+              <w:t>{pi_phone}</w:t>
+            </w:r>
           </w:p>
         </w:tc>
         <w:tc>
@@ -4336,6 +4339,9 @@
                 <w:szCs w:val="20"/>
               </w:rPr>
             </w:pPr>
+            <w:r>
+              <w:t>{pi_fax}</w:t>
+            </w:r>
           </w:p>
         </w:tc>
       </w:tr>
@@ -4380,6 +4386,9 @@
                 <w:szCs w:val="20"/>
               </w:rPr>
             </w:pPr>
+            <w:r>
+              <w:t>{pi_email}</w:t>
+            </w:r>
           </w:p>
         </w:tc>
       </w:tr>
@@ -4424,6 +4433,9 @@
                 <w:szCs w:val="20"/>
               </w:rPr>
             </w:pPr>
+            <w:r>
+              <w:t>{pi_address}</w:t>
+            </w:r>
           </w:p>
         </w:tc>
       </w:tr>
@@ -4474,7 +4486,7 @@
                 <w:sz w:val="20"/>
                 <w:szCs w:val="20"/>
               </w:rPr>
-              <w:t>{pi_name_zh}</w:t>
+              <w:t>{contact_name_zh}</w:t>
             </w:r>
           </w:p>
         </w:tc>
@@ -4538,7 +4550,7 @@
                 <w:sz w:val="20"/>
                 <w:szCs w:val="20"/>
               </w:rPr>
-              <w:t>{pi_name_zh}</w:t>
+              <w:t>{contact_title}</w:t>
             </w:r>
           </w:p>
         </w:tc>
@@ -4596,6 +4608,9 @@
                 <w:szCs w:val="20"/>
               </w:rPr>
             </w:pPr>
+            <w:r>
+              <w:t>{contact_phone}</w:t>
+            </w:r>
           </w:p>
         </w:tc>
         <w:tc>
@@ -4660,6 +4675,9 @@
                 <w:szCs w:val="20"/>
               </w:rPr>
             </w:pPr>
+            <w:r>
+              <w:t>{contact_fax}</w:t>
+            </w:r>
           </w:p>
         </w:tc>
       </w:tr>
@@ -4704,6 +4722,9 @@
                 <w:szCs w:val="20"/>
               </w:rPr>
             </w:pPr>
+            <w:r>
+              <w:t>{contact_email}</w:t>
+            </w:r>
           </w:p>
         </w:tc>
       </w:tr>
@@ -4748,6 +4769,9 @@
                 <w:szCs w:val="20"/>
               </w:rPr>
             </w:pPr>
+            <w:r>
+              <w:t>{contact_address}</w:t>
+            </w:r>
           </w:p>
         </w:tc>
       </w:tr>
@@ -4960,6 +4984,11 @@
       </w:r>
     </w:p>
     <w:p>
+      <w:r>
+        <w:t>{purpose}</w:t>
+      </w:r>
+    </w:p>
+    <w:p>
       <w:pPr>
         <w:ind w:leftChars="200" w:left="480"/>
         <w:jc w:val="both"/>
@@ -5044,6 +5073,11 @@
           <w:rFonts w:ascii="Times New Roman" w:eastAsia="DFKai-SB" w:hAnsi="Times New Roman" w:cs="Times New Roman" w:hint="eastAsia"/>
         </w:rPr>
         <w:t>本計畫與防疫工作之相關性等。</w:t>
+      </w:r>
+    </w:p>
+    <w:p>
+      <w:r>
+        <w:t>{background}</w:t>
       </w:r>
     </w:p>
     <w:p>
@@ -5223,6 +5257,11 @@
       </w:r>
     </w:p>
     <w:p>
+      <w:r>
+        <w:t>{methodology}</w:t>
+      </w:r>
+    </w:p>
+    <w:p>
       <w:pPr>
         <w:ind w:leftChars="200" w:left="480"/>
         <w:jc w:val="both"/>
@@ -5300,6 +5339,11 @@
       </w:r>
     </w:p>
     <w:p>
+      <w:r>
+        <w:t>{expected_outcome}</w:t>
+      </w:r>
+    </w:p>
+    <w:p>
       <w:pPr>
         <w:ind w:leftChars="200" w:left="480"/>
         <w:jc w:val="both"/>
@@ -5362,6 +5406,11 @@
           <w:rFonts w:ascii="Times New Roman" w:eastAsia="DFKai-SB" w:hAnsi="Times New Roman" w:cs="Times New Roman" w:hint="eastAsia"/>
         </w:rPr>
         <w:t>六、重要參考文獻：依一般科學論文之參考文獻撰寫方式，列出所引用之參考文獻，並於計畫內容引用處標註之。</w:t>
+      </w:r>
+    </w:p>
+    <w:p>
+      <w:r>
+        <w:t>{references}</w:t>
       </w:r>
     </w:p>
     <w:p>
@@ -9902,6 +9951,9 @@
                 <w:rFonts w:ascii="Times New Roman" w:eastAsia="DFKai-SB" w:hAnsi="Times New Roman" w:cs="Times New Roman"/>
               </w:rPr>
             </w:pPr>
+            <w:r>
+              <w:t>{#personnel_rows}{role_text}</w:t>
+            </w:r>
           </w:p>
         </w:tc>
         <w:tc>
@@ -9916,6 +9968,9 @@
                 <w:rFonts w:ascii="Times New Roman" w:eastAsia="DFKai-SB" w:hAnsi="Times New Roman" w:cs="Times New Roman"/>
               </w:rPr>
             </w:pPr>
+            <w:r>
+              <w:t>{name_zh}</w:t>
+            </w:r>
           </w:p>
         </w:tc>
         <w:tc>
@@ -9930,6 +9985,9 @@
                 <w:rFonts w:ascii="Times New Roman" w:eastAsia="DFKai-SB" w:hAnsi="Times New Roman" w:cs="Times New Roman"/>
               </w:rPr>
             </w:pPr>
+            <w:r>
+              <w:t>{title}</w:t>
+            </w:r>
           </w:p>
         </w:tc>
         <w:tc>
@@ -9944,6 +10002,9 @@
                 <w:rFonts w:ascii="Times New Roman" w:eastAsia="DFKai-SB" w:hAnsi="Times New Roman" w:cs="Times New Roman"/>
               </w:rPr>
             </w:pPr>
+            <w:r>
+              <w:t>{work_description}{/personnel_rows}</w:t>
+            </w:r>
           </w:p>
         </w:tc>
       </w:tr>

</xml_diff>

<commit_message>
Keep parentheses around TOC page numbers in DOC-4; add page number update reminder on ZIP download
Co-Authored-By: Claude Opus 4.6 <noreply@anthropic.com>
</commit_message>
<xml_diff>
--- a/public/templates/DOC-4.docx
+++ b/public/templates/DOC-4.docx
@@ -705,7 +705,7 @@
           <w:sz w:val="28"/>
         </w:rPr>
         <w:tab/>
-        <w:t/>
+        <w:t>(</w:t>
       </w:r>
       <w:r>
         <w:fldChar w:fldCharType="begin"/>
@@ -723,7 +723,7 @@
         <w:fldChar w:fldCharType="end"/>
       </w:r>
       <w:r>
-        <w:t/>
+        <w:t>)</w:t>
       </w:r>
     </w:p>
     <w:p>
@@ -751,7 +751,7 @@
           <w:sz w:val="28"/>
         </w:rPr>
         <w:tab/>
-        <w:t/>
+        <w:t>(</w:t>
       </w:r>
       <w:r>
         <w:fldChar w:fldCharType="begin"/>
@@ -769,7 +769,7 @@
         <w:fldChar w:fldCharType="end"/>
       </w:r>
       <w:r>
-        <w:t/>
+        <w:t>)</w:t>
       </w:r>
     </w:p>
     <w:p>
@@ -797,7 +797,7 @@
           <w:sz w:val="28"/>
         </w:rPr>
         <w:tab/>
-        <w:t/>
+        <w:t>(</w:t>
       </w:r>
       <w:r>
         <w:fldChar w:fldCharType="begin"/>
@@ -815,7 +815,7 @@
         <w:fldChar w:fldCharType="end"/>
       </w:r>
       <w:r>
-        <w:t/>
+        <w:t>)</w:t>
       </w:r>
     </w:p>
     <w:p>
@@ -843,7 +843,7 @@
           <w:sz w:val="28"/>
         </w:rPr>
         <w:tab/>
-        <w:t/>
+        <w:t>(</w:t>
       </w:r>
       <w:r>
         <w:fldChar w:fldCharType="begin"/>
@@ -861,7 +861,7 @@
         <w:fldChar w:fldCharType="end"/>
       </w:r>
       <w:r>
-        <w:t/>
+        <w:t>)</w:t>
       </w:r>
     </w:p>
     <w:p>
@@ -890,7 +890,7 @@
           <w:sz w:val="28"/>
         </w:rPr>
         <w:tab/>
-        <w:t/>
+        <w:t>(</w:t>
       </w:r>
       <w:r>
         <w:fldChar w:fldCharType="begin"/>
@@ -908,7 +908,7 @@
         <w:fldChar w:fldCharType="end"/>
       </w:r>
       <w:r>
-        <w:t/>
+        <w:t>)</w:t>
       </w:r>
     </w:p>
     <w:p>
@@ -937,7 +937,7 @@
           <w:sz w:val="28"/>
         </w:rPr>
         <w:tab/>
-        <w:t/>
+        <w:t>(</w:t>
       </w:r>
       <w:r>
         <w:fldChar w:fldCharType="begin"/>
@@ -955,7 +955,7 @@
         <w:fldChar w:fldCharType="end"/>
       </w:r>
       <w:r>
-        <w:t/>
+        <w:t>)</w:t>
       </w:r>
     </w:p>
     <w:p>
@@ -984,7 +984,7 @@
           <w:sz w:val="28"/>
         </w:rPr>
         <w:tab/>
-        <w:t/>
+        <w:t>(</w:t>
       </w:r>
       <w:r>
         <w:fldChar w:fldCharType="begin"/>
@@ -1002,7 +1002,7 @@
         <w:fldChar w:fldCharType="end"/>
       </w:r>
       <w:r>
-        <w:t/>
+        <w:t>)</w:t>
       </w:r>
     </w:p>
     <w:p>
@@ -1031,7 +1031,7 @@
           <w:sz w:val="28"/>
         </w:rPr>
         <w:tab/>
-        <w:t/>
+        <w:t>(</w:t>
       </w:r>
       <w:r>
         <w:fldChar w:fldCharType="begin"/>
@@ -1049,7 +1049,7 @@
         <w:fldChar w:fldCharType="end"/>
       </w:r>
       <w:r>
-        <w:t/>
+        <w:t>)</w:t>
       </w:r>
     </w:p>
     <w:p>
@@ -1078,7 +1078,7 @@
           <w:sz w:val="28"/>
         </w:rPr>
         <w:tab/>
-        <w:t/>
+        <w:t>(</w:t>
       </w:r>
       <w:r>
         <w:fldChar w:fldCharType="begin"/>
@@ -1096,7 +1096,7 @@
         <w:fldChar w:fldCharType="end"/>
       </w:r>
       <w:r>
-        <w:t/>
+        <w:t>)</w:t>
       </w:r>
     </w:p>
     <w:p>
@@ -1125,7 +1125,7 @@
           <w:sz w:val="28"/>
         </w:rPr>
         <w:tab/>
-        <w:t/>
+        <w:t>(</w:t>
       </w:r>
       <w:r>
         <w:fldChar w:fldCharType="begin"/>
@@ -1143,7 +1143,7 @@
         <w:fldChar w:fldCharType="end"/>
       </w:r>
       <w:r>
-        <w:t/>
+        <w:t>)</w:t>
       </w:r>
     </w:p>
     <w:p>
@@ -1172,7 +1172,7 @@
           <w:sz w:val="28"/>
         </w:rPr>
         <w:tab/>
-        <w:t/>
+        <w:t>(</w:t>
       </w:r>
       <w:r>
         <w:fldChar w:fldCharType="begin"/>
@@ -1190,7 +1190,7 @@
         <w:fldChar w:fldCharType="end"/>
       </w:r>
       <w:r>
-        <w:t/>
+        <w:t>)</w:t>
       </w:r>
     </w:p>
     <w:p>
@@ -1218,7 +1218,7 @@
           <w:sz w:val="28"/>
         </w:rPr>
         <w:tab/>
-        <w:t/>
+        <w:t>(</w:t>
       </w:r>
       <w:r>
         <w:fldChar w:fldCharType="begin"/>
@@ -1236,7 +1236,7 @@
         <w:fldChar w:fldCharType="end"/>
       </w:r>
       <w:r>
-        <w:t/>
+        <w:t>)</w:t>
       </w:r>
     </w:p>
     <w:p>
@@ -1270,7 +1270,7 @@
           <w:rFonts w:ascii="Times New Roman" w:eastAsia="DFKai-SB" w:hAnsi="Times New Roman" w:cs="Times New Roman"/>
           <w:sz w:val="28"/>
         </w:rPr>
-        <w:t/>
+        <w:t>(</w:t>
       </w:r>
       <w:r>
         <w:fldChar w:fldCharType="begin"/>
@@ -1288,7 +1288,7 @@
         <w:fldChar w:fldCharType="end"/>
       </w:r>
       <w:r>
-        <w:t/>
+        <w:t>)</w:t>
       </w:r>
     </w:p>
     <w:p>
@@ -1316,7 +1316,7 @@
           <w:sz w:val="28"/>
         </w:rPr>
         <w:tab/>
-        <w:t/>
+        <w:t>(</w:t>
       </w:r>
       <w:r>
         <w:fldChar w:fldCharType="begin"/>
@@ -1334,7 +1334,7 @@
         <w:fldChar w:fldCharType="end"/>
       </w:r>
       <w:r>
-        <w:t/>
+        <w:t>)</w:t>
       </w:r>
     </w:p>
     <w:p>
@@ -1364,7 +1364,7 @@
           <w:sz w:val="28"/>
         </w:rPr>
         <w:tab/>
-        <w:t/>
+        <w:t>(</w:t>
       </w:r>
       <w:r>
         <w:fldChar w:fldCharType="begin"/>
@@ -1382,7 +1382,7 @@
         <w:fldChar w:fldCharType="end"/>
       </w:r>
       <w:r>
-        <w:t/>
+        <w:t>)</w:t>
       </w:r>
     </w:p>
     <w:p>

</xml_diff>